<commit_message>
Rewrite abstract in academic style without course references
Co-authored-by: ruiheng111 <ruiheng111@users.noreply.github.com>
</commit_message>
<xml_diff>
--- a/1997亚洲金融危机.docx
+++ b/1997亚洲金融危机.docx
@@ -29,7 +29,7 @@
           <w:b w:val="0"/>
           <w:sz w:val="21"/>
         </w:rPr>
-        <w:t>摘要：本文在刘泽豪老师第十二讲“金融脆弱性与金融危机”的分析框架下，分别考察1997年亚洲金融危机与2010—2018年欧元区主权债务危机的脆弱性积累、爆发传导、政策应对与成因机制，并与课上重点讨论的美国1907年恐慌、大萧条与2007—2009年全球金融危机进行对照。两场危机均发生在金融自由化与跨境资本流动加速背景下：亚洲危机表现为固定汇率、短期外债与银行体系期限/货币错配相互强化；欧元区危机则体现为“统一货币—分散财政”的不完备货币联盟结构，以及主权—银行反馈环下的恐慌自我实现。政策层面，二者均凸显最后贷款人、存款担保/银行重组与宏观政策两难，但亚洲更多依赖IMF牵头救助与各国差异化路径，欧元区则通过EFSM/ESM、OMT与QE逐步补建区域金融稳定架构。跨案例比较表明，金融危机虽形态各异，却共享“脆弱性积累—触发事件—挤兑/重定价—实体衰退”链条；理解危机的关键在于识别制度约束如何放大金融自由化的激励扭曲，而非将冲击简单归因于投机攻击或单一政策失误。</w:t>
+        <w:t>摘要：本文比较分析1997年亚洲金融危机与2010—2018年欧元区主权债务危机，考察二者在脆弱性积累、冲击传导、恐慌扩散与政策应对方面的机制异同，并将其与美国1907年银行恐慌、1929—1933年大萧条及2007—2009年全球金融危机置于同一历史脉络中对照。两场危机均发生在金融深化与跨境资本流动加速的背景下，但嵌入的制度约束不同：亚洲危机突出固定汇率、短期外债攀升及银行体系货币错配与期限错配的相互强化；欧元区危机则体现为不完备货币联盟下“统一货币—分散财政”的结构矛盾，以及主权信用重定价与本国银行资产负债表之间的负向反馈。政策应对上，二者均凸显最后贷款人、问题机构处置、存款与融资稳定机制及预期管理的关键作用，但亚洲更多依赖汇率调整、IMF框架下的官方融资与各国差异化的银行重组，欧元区则经历从财政紧缩到EFSF/ESM区域救助、2012年OMT承诺及此后量化宽松和银行业联盟建设的渐进补建。跨案例比较表明，重大金融危机虽形态各异，却反复呈现“繁荣期脆弱性积累—局部冲击触发重定价—恐慌沿融资网络扩散—实体衰退加深”的演化链条；识别并打断负向反馈环，比简单复制某一历史案例的政策模板更为根本。</w:t>
       </w:r>
     </w:p>
     <w:p>
@@ -43,7 +43,7 @@
           <w:b w:val="0"/>
           <w:sz w:val="21"/>
         </w:rPr>
-        <w:t>关键词：金融脆弱性；金融自由化；货币危机；银行危机；最后贷款人；传染</w:t>
+        <w:t>关键词：金融脆弱性；金融自由化；货币危机；主权债务危机；最后贷款人；传染</w:t>
       </w:r>
     </w:p>
     <w:p>

</xml_diff>

<commit_message>
Add course postscript to end of combined paper
Co-authored-by: ruiheng111 <ruiheng111@users.noreply.github.com>
</commit_message>
<xml_diff>
--- a/1997亚洲金融危机.docx
+++ b/1997亚洲金融危机.docx
@@ -6844,6 +6844,34 @@
       </w:pPr>
       <w:bookmarkStart w:id="2" w:name="_GoBack"/>
       <w:bookmarkEnd w:id="2"/>
+    </w:p>
+    <w:p>
+      <w:pPr>
+        <w:spacing w:line="360" w:lineRule="auto" w:after="120" w:before="240"/>
+        <w:ind w:firstLine="0"/>
+      </w:pPr>
+      <w:r>
+        <w:rPr>
+          <w:rFonts w:ascii="Times New Roman" w:hAnsi="Times New Roman" w:eastAsia="宋体"/>
+          <w:b/>
+          <w:sz w:val="24"/>
+        </w:rPr>
+        <w:t>后记</w:t>
+      </w:r>
+    </w:p>
+    <w:p>
+      <w:pPr>
+        <w:spacing w:line="360" w:lineRule="auto" w:after="0"/>
+        <w:ind w:firstLine="420"/>
+      </w:pPr>
+      <w:r>
+        <w:rPr>
+          <w:rFonts w:ascii="Times New Roman" w:hAnsi="Times New Roman" w:eastAsia="宋体"/>
+          <w:b w:val="0"/>
+          <w:sz w:val="21"/>
+        </w:rPr>
+        <w:t>转眼，又一个学期走到了尾声。回想大学这几年，前几学期我们几乎没有接触系统性的金融专业课，对“金融学”三个字多少还是有些距离感——知道它与我们未来密切相关，却很难真正走进去。这学期修读刘老师的金融学课程，于我而言不只是一门课的结束，更像是一扇门被推开：老师上课深入浅出，把复杂的机制讲得清楚有趣，案例与理论穿插之间干货满满，让我第一次觉得，金融学不是远在天边的术语，而是可以用来理解真实世界变化的工具。本篇论文写作的过程，比我想象中要长得多，也比我预想的更有收获。为了把1997年亚洲金融危机与欧元区主权债务危机的机制与对照写清楚，我反复阅读文献、核对数据，许多理解是在课堂之外一点一点沉下来的——比如繁荣期脆弱性如何被低估，局部冲击又如何沿银行间和跨境融资网络扩散；又比如不同制度约束下，最后贷款人与问题机构处置为何呈现出截然不同的政策空间。有时为了一个出处的核对看到深夜，有时读完一篇经典文献，忽然回过味来老师课上某句话的分量，那种“原来如此”的豁然开朗，大概就是这个学期留给我的最踏实的一份收获。课程即将结束，心里多少有些不舍。非常荣幸能在本学期跟随刘老师学习，感谢老师一学期以来的悉心讲授。也衷心祝愿老师身体健康，工作顺利！</w:t>
+      </w:r>
     </w:p>
     <w:sectPr>
       <w:pgSz w:w="12240" w:h="15840"/>

</xml_diff>